<commit_message>
24 hour calibration based on start time and crds location
</commit_message>
<xml_diff>
--- a/meta_data/OTICE_CRDS_calibration_routine_Silvia.docx
+++ b/meta_data/OTICE_CRDS_calibration_routine_Silvia.docx
@@ -441,7 +441,7 @@
                 <w:sz w:val="16"/>
                 <w:szCs w:val="16"/>
               </w:rPr>
-              <w:t>24 or 27</w:t>
+              <w:t xml:space="preserve">24 </w:t>
             </w:r>
           </w:p>
         </w:tc>
@@ -611,7 +611,7 @@
                 <w:sz w:val="16"/>
                 <w:szCs w:val="16"/>
               </w:rPr>
-              <w:t>24 or 27</w:t>
+              <w:t xml:space="preserve">24 </w:t>
             </w:r>
           </w:p>
         </w:tc>
@@ -781,7 +781,7 @@
                 <w:sz w:val="16"/>
                 <w:szCs w:val="16"/>
               </w:rPr>
-              <w:t>24 or 27</w:t>
+              <w:t xml:space="preserve">24 </w:t>
             </w:r>
           </w:p>
         </w:tc>
@@ -951,7 +951,7 @@
                 <w:sz w:val="16"/>
                 <w:szCs w:val="16"/>
               </w:rPr>
-              <w:t>24 or 27</w:t>
+              <w:t xml:space="preserve">24 </w:t>
             </w:r>
           </w:p>
         </w:tc>
@@ -1121,7 +1121,7 @@
                 <w:sz w:val="16"/>
                 <w:szCs w:val="16"/>
               </w:rPr>
-              <w:t>24 or 27</w:t>
+              <w:t xml:space="preserve">24 </w:t>
             </w:r>
           </w:p>
         </w:tc>
@@ -1291,7 +1291,7 @@
                 <w:sz w:val="16"/>
                 <w:szCs w:val="16"/>
               </w:rPr>
-              <w:t>24 or 27</w:t>
+              <w:t xml:space="preserve">24 </w:t>
             </w:r>
           </w:p>
         </w:tc>
@@ -1461,7 +1461,7 @@
                 <w:sz w:val="16"/>
                 <w:szCs w:val="16"/>
               </w:rPr>
-              <w:t>24 or 27</w:t>
+              <w:t xml:space="preserve">24 </w:t>
             </w:r>
           </w:p>
         </w:tc>

</xml_diff>